<commit_message>
Expand lab 1 report with color model theory
</commit_message>
<xml_diff>
--- a/lab1/Отчёт_Лабораторная_1.docx
+++ b/lab1/Отчёт_Лабораторная_1.docx
@@ -23,7 +23,92 @@
         <w:pStyle w:val="Heading1"/>
       </w:pPr>
       <w:r>
-        <w:t>2 Математические основы</w:t>
+        <w:t>2 Изучение цветовых моделей</w:t>
+      </w:r>
+    </w:p>
+    <w:p>
+      <w:r>
+        <w:rPr>
+          <w:b w:val="0"/>
+        </w:rPr>
+        <w:t>Цветовая модель описывает цвет набором числовых компонент. В работе рассмотрены RGB, CMYK и HLS: они позволяют задавать один цвет разными способами и применяются для разных задач.</w:t>
+      </w:r>
+    </w:p>
+    <w:p>
+      <w:pPr>
+        <w:pStyle w:val="Heading2"/>
+      </w:pPr>
+      <w:r>
+        <w:t>RGB</w:t>
+      </w:r>
+    </w:p>
+    <w:p>
+      <w:r>
+        <w:rPr>
+          <w:b w:val="0"/>
+        </w:rPr>
+        <w:t>RGB — аддитивная модель смешения красного (R), зелёного (G) и синего (B) света. При увеличении компонент добавляется свет: RGB (0, 0, 0) соответствует чёрному, (255, 255, 255) — белому, (255, 0, 0) — красному. Модель используется в экранах и цифровых изображениях. В обычном 8-битном представлении каждый канал принимает целые значения от 0 до 255.</w:t>
+      </w:r>
+    </w:p>
+    <w:p>
+      <w:pPr>
+        <w:pStyle w:val="Heading2"/>
+      </w:pPr>
+      <w:r>
+        <w:t>CMYK</w:t>
+      </w:r>
+    </w:p>
+    <w:p>
+      <w:r>
+        <w:rPr>
+          <w:b w:val="0"/>
+        </w:rPr>
+        <w:t>CMYK — субтрактивная модель, используемая в печати. Компоненты C, M, Y и K задают количество голубой, пурпурной, жёлтой и чёрной краски в процентах. Краски поглощают часть падающего света; отсутствие краски на белой бумаге соответствует белому цвету. Отдельный чёрный канал позволяет получать насыщенный чёрный и уменьшать расход цветных красок. Реальный результат печати зависит от бумаги, чернил и цветового профиля.</w:t>
+      </w:r>
+    </w:p>
+    <w:p>
+      <w:pPr>
+        <w:pStyle w:val="Heading2"/>
+      </w:pPr>
+      <w:r>
+        <w:t>HLS</w:t>
+      </w:r>
+    </w:p>
+    <w:p>
+      <w:r>
+        <w:rPr>
+          <w:b w:val="0"/>
+        </w:rPr>
+        <w:t>HLS задаёт цвет через тон H, светлоту L и насыщенность S. Тон — угол на цветовом круге: 0° соответствует красному, 120° — зелёному, 240° — синему; 360° совпадает с 0°. Светлота изменяется от 0% (чёрный) до 100% (белый). Насыщенность 0% даёт серый цвет, а 100% — максимальную насыщенность при выбранной светлоте. Например, HLS (0°, 50%, 100%) соответствует красному. Модель удобна для интерактивного подбора цвета. Название HSL обозначает ту же модель с другим порядком компонент.</w:t>
+      </w:r>
+    </w:p>
+    <w:p>
+      <w:pPr>
+        <w:pStyle w:val="Heading2"/>
+      </w:pPr>
+      <w:r>
+        <w:t>Особенности преобразований</w:t>
+      </w:r>
+    </w:p>
+    <w:p>
+      <w:r>
+        <w:rPr>
+          <w:b w:val="0"/>
+        </w:rPr>
+        <w:t>Преобразование сохраняет цвет, но не всегда исходные координаты. В учебной модели наборы CMYK (100%, 100%, 100%, 0%) и (0%, 0%, 0%, 100%) дают один чёрный RGB (0, 0, 0). При нулевой насыщенности HLS тон не влияет на цвет, поэтому восстановить его из RGB нельзя. Округление RGB до целых значений также может вносить погрешность; в приложении промежуточные расчёты сохраняют дробную точность.</w:t>
+      </w:r>
+    </w:p>
+    <w:p>
+      <w:r>
+        <w:br w:type="page"/>
+      </w:r>
+    </w:p>
+    <w:p>
+      <w:pPr>
+        <w:pStyle w:val="Heading1"/>
+      </w:pPr>
+      <w:r>
+        <w:t>3 Математические основы</w:t>
       </w:r>
     </w:p>
     <w:p>
@@ -39,7 +124,7 @@
         <w:pStyle w:val="Heading2"/>
       </w:pPr>
       <w:r>
-        <w:t>2 1 Преобразование RGB и CMYK</w:t>
+        <w:t>3 1 Преобразование RGB и CMYK</w:t>
       </w:r>
     </w:p>
     <w:p>
@@ -156,7 +241,7 @@
         <w:pStyle w:val="Heading2"/>
       </w:pPr>
       <w:r>
-        <w:t>2 2 Преобразование RGB в HLS</w:t>
+        <w:t>3 2 Преобразование RGB в HLS</w:t>
       </w:r>
     </w:p>
     <w:p>
@@ -240,7 +325,7 @@
         <w:pStyle w:val="Heading2"/>
       </w:pPr>
       <w:r>
-        <w:t>2 3 Преобразование HLS в RGB</w:t>
+        <w:t>3 3 Преобразование HLS в RGB</w:t>
       </w:r>
     </w:p>
     <w:p>
@@ -540,7 +625,7 @@
         <w:pStyle w:val="Heading1"/>
       </w:pPr>
       <w:r>
-        <w:t>3 Средства и реализация</w:t>
+        <w:t>4 Средства и реализация</w:t>
       </w:r>
     </w:p>
     <w:p>
@@ -572,7 +657,7 @@
         <w:pStyle w:val="Heading1"/>
       </w:pPr>
       <w:r>
-        <w:t>4 Интерфейс приложения</w:t>
+        <w:t>5 Интерфейс приложения</w:t>
       </w:r>
     </w:p>
     <w:p>
@@ -640,7 +725,7 @@
         <w:pStyle w:val="Heading1"/>
       </w:pPr>
       <w:r>
-        <w:t>5 Проверка корректности</w:t>
+        <w:t>6 Проверка корректности</w:t>
       </w:r>
     </w:p>
     <w:p>
@@ -1212,7 +1297,7 @@
         <w:pStyle w:val="Heading1"/>
       </w:pPr>
       <w:r>
-        <w:t>6 Выводы</w:t>
+        <w:t>7 Выводы</w:t>
       </w:r>
     </w:p>
     <w:p>

</xml_diff>

<commit_message>
Separate results and conclusions in lab 1 report
</commit_message>
<xml_diff>
--- a/lab1/Отчёт_Лабораторная_1.docx
+++ b/lab1/Отчёт_Лабораторная_1.docx
@@ -1297,7 +1297,7 @@
         <w:pStyle w:val="Heading1"/>
       </w:pPr>
       <w:r>
-        <w:t>7 Выводы</w:t>
+        <w:t>7 Результаты</w:t>
       </w:r>
     </w:p>
     <w:p>
@@ -1306,6 +1306,14 @@
           <w:b w:val="0"/>
         </w:rPr>
         <w:t>Разработано веб-приложение для нечётного варианта CMYK–RGB–HLS. Реализованы три способа задания цвета и автоматический пересчёт при изменении любой компоненты. Эталонные и случайные тесты подтвердили корректность формул в пределах выбранного допуска; проверки интерфейса подтвердили синхронизацию и обработку неверного ввода.</w:t>
+      </w:r>
+    </w:p>
+    <w:p>
+      <w:pPr>
+        <w:pStyle w:val="Heading1"/>
+      </w:pPr>
+      <w:r>
+        <w:t>8 Выводы</w:t>
       </w:r>
     </w:p>
     <w:p>

</xml_diff>

<commit_message>
Expand conclusions with reversibility and precision examples
</commit_message>
<xml_diff>
--- a/lab1/Отчёт_Лабораторная_1.docx
+++ b/lab1/Отчёт_Лабораторная_1.docx
@@ -1309,6 +1309,11 @@
       </w:r>
     </w:p>
     <w:p>
+      <w:r>
+        <w:br w:type="page"/>
+      </w:r>
+    </w:p>
+    <w:p>
       <w:pPr>
         <w:pStyle w:val="Heading1"/>
       </w:pPr>
@@ -1321,7 +1326,71 @@
         <w:rPr>
           <w:b w:val="0"/>
         </w:rPr>
-        <w:t>Установлено, что светлота HLS определяется средним максимума и минимума RGB, а при нулевой насыщенности тон не влияет на результат. Для чёрного RGB нужна отдельная ветвь преобразования в CMYK. Обратное преобразование CMYK не обязано восстанавливать исходные доли красок, поскольку разные наборы могут описывать один RGB.</w:t>
+        <w:t>В ходе работы изучены цветовые модели RGB, CMYK и HLS и способы перехода между ними. RGB описывает аддитивное смешение света и применяется для экранного представления цвета. CMYK описывает субтрактивное смешение красок и используется в печати. HLS позволяет отдельно задавать тон, светлоту и насыщенность, поэтому удобна для подбора цвета. Выбор модели зависит от задачи, хотя один цвет можно выразить координатами каждой из рассмотренных моделей.</w:t>
+      </w:r>
+    </w:p>
+    <w:p>
+      <w:pPr>
+        <w:pStyle w:val="Heading2"/>
+      </w:pPr>
+      <w:r>
+        <w:t>Обратимость преобразований</w:t>
+      </w:r>
+    </w:p>
+    <w:p>
+      <w:r>
+        <w:rPr>
+          <w:b w:val="0"/>
+        </w:rPr>
+        <w:t>Сохранение цвета при пересчёте не означает обязательного восстановления исходных координат. В учебных формулах CMYK разные сочетания четырёх компонент могут давать одинаковый RGB. Например, CMYK (100%, 100%, 100%, 0%) и (0%, 0%, 0%, 100%) преобразуются в чёрный RGB (0, 0, 0). Обратный алгоритм выбирает второй набор. Следовательно, цикл CMYK → RGB → CMYK может изменить доли красок, сохранив отображаемый цвет. При K = 100% результат не зависит от C, M и Y; для чёрного RGB в обратной формуле необходима отдельная ветвь, исключающая деление на ноль.</w:t>
+      </w:r>
+    </w:p>
+    <w:p>
+      <w:r>
+        <w:rPr>
+          <w:b w:val="0"/>
+        </w:rPr>
+        <w:t>В HLS неоднозначность возникает для ахроматических цветов. При S = 0% тон не влияет на результат: HLS (0°, 50%, 0%) и (120°, 50%, 0%) дают одинаковый серый цвет. Восстановить исходный тон из RGB невозможно, поэтому алгоритм условно принимает H = 0°. При L = 0% получается чёрный, а при L = 100% — белый независимо от тона и насыщенности. Такие изменения координат при обратном пересчёте связаны со свойствами модели, а не обязательно с ошибкой вычислений.</w:t>
+      </w:r>
+    </w:p>
+    <w:p>
+      <w:pPr>
+        <w:pStyle w:val="Heading2"/>
+      </w:pPr>
+      <w:r>
+        <w:t>Точность вычислений</w:t>
+      </w:r>
+    </w:p>
+    <w:p>
+      <w:r>
+        <w:rPr>
+          <w:b w:val="0"/>
+        </w:rPr>
+        <w:t>Округление RGB до целых значений приводит к потере части информации. Например, HLS (120°, 25%, 100%) даёт RGB (0, 127,5, 0), тогда как HEX #008000 соответствует RGB (0, 128, 0). После обратного пересчёта округлённого значения светлота составит примерно 25,098%, а не 25%. Поэтому в приложении промежуточные значения сохраняются с дробной точностью, а округление до 8 бит выполняется только для HEX и стандартной палитры. Поля показывают до трёх знаков после запятой, что также нужно учитывать при сравнении отображаемых чисел.</w:t>
+      </w:r>
+    </w:p>
+    <w:p>
+      <w:r>
+        <w:rPr>
+          <w:b w:val="0"/>
+        </w:rPr>
+        <w:t>Проверки циклов RGB → модель → RGB показали максимальную ошибку около 4,2633 × 10⁻¹³ при допуске 10⁻⁸. Это подтверждает численную согласованность реализованных формул на проверенном наборе цветов. Такой результат не означает обратимость любых исходных координат CMYK или HLS и не оценивает точность реальной цветопередачи устройств.</w:t>
+      </w:r>
+    </w:p>
+    <w:p>
+      <w:pPr>
+        <w:pStyle w:val="Heading2"/>
+      </w:pPr>
+      <w:r>
+        <w:t>Практическое применение</w:t>
+      </w:r>
+    </w:p>
+    <w:p>
+      <w:r>
+        <w:rPr>
+          <w:b w:val="0"/>
+        </w:rPr>
+        <w:t>Синхронное отображение трёх моделей позволяет наблюдать, как изменение одной компоненты отражается на остальных представлениях цвета. Для печати учебного пересчёта RGB ↔ CMYK недостаточно: результат зависит от цветового профиля, бумаги и красок. Таким образом, приложение подходит для изучения моделей и проверки формул, а точное согласование экранного и печатного цвета требует учёта характеристик устройств.</w:t>
       </w:r>
     </w:p>
     <w:sectPr>

</xml_diff>

<commit_message>
Shorten lab 1 conclusions
</commit_message>
<xml_diff>
--- a/lab1/Отчёт_Лабораторная_1.docx
+++ b/lab1/Отчёт_Лабораторная_1.docx
@@ -754,7 +754,7 @@
           </w:tcPr>
           <w:p>
             <w:pPr>
-              <w:spacing w:after="100" w:before="100"/>
+              <w:spacing w:after="60" w:before="60"/>
             </w:pPr>
             <w:r>
               <w:rPr>
@@ -771,7 +771,7 @@
           </w:tcPr>
           <w:p>
             <w:pPr>
-              <w:spacing w:after="100" w:before="100"/>
+              <w:spacing w:after="60" w:before="60"/>
             </w:pPr>
             <w:r>
               <w:rPr>
@@ -788,7 +788,7 @@
           </w:tcPr>
           <w:p>
             <w:pPr>
-              <w:spacing w:after="100" w:before="100"/>
+              <w:spacing w:after="60" w:before="60"/>
             </w:pPr>
             <w:r>
               <w:rPr>
@@ -807,7 +807,7 @@
           </w:tcPr>
           <w:p>
             <w:pPr>
-              <w:spacing w:after="100" w:before="100"/>
+              <w:spacing w:after="60" w:before="60"/>
             </w:pPr>
             <w:r>
               <w:rPr>
@@ -823,7 +823,7 @@
           </w:tcPr>
           <w:p>
             <w:pPr>
-              <w:spacing w:after="100" w:before="100"/>
+              <w:spacing w:after="60" w:before="60"/>
             </w:pPr>
             <w:r>
               <w:rPr>
@@ -839,7 +839,7 @@
           </w:tcPr>
           <w:p>
             <w:pPr>
-              <w:spacing w:after="100" w:before="100"/>
+              <w:spacing w:after="60" w:before="60"/>
             </w:pPr>
             <w:r>
               <w:rPr>
@@ -857,7 +857,7 @@
           </w:tcPr>
           <w:p>
             <w:pPr>
-              <w:spacing w:after="100" w:before="100"/>
+              <w:spacing w:after="60" w:before="60"/>
             </w:pPr>
             <w:r>
               <w:rPr>
@@ -873,7 +873,7 @@
           </w:tcPr>
           <w:p>
             <w:pPr>
-              <w:spacing w:after="100" w:before="100"/>
+              <w:spacing w:after="60" w:before="60"/>
             </w:pPr>
             <w:r>
               <w:rPr>
@@ -889,7 +889,7 @@
           </w:tcPr>
           <w:p>
             <w:pPr>
-              <w:spacing w:after="100" w:before="100"/>
+              <w:spacing w:after="60" w:before="60"/>
             </w:pPr>
             <w:r>
               <w:rPr>
@@ -907,7 +907,7 @@
           </w:tcPr>
           <w:p>
             <w:pPr>
-              <w:spacing w:after="100" w:before="100"/>
+              <w:spacing w:after="60" w:before="60"/>
             </w:pPr>
             <w:r>
               <w:rPr>
@@ -923,7 +923,7 @@
           </w:tcPr>
           <w:p>
             <w:pPr>
-              <w:spacing w:after="100" w:before="100"/>
+              <w:spacing w:after="60" w:before="60"/>
             </w:pPr>
             <w:r>
               <w:rPr>
@@ -939,7 +939,7 @@
           </w:tcPr>
           <w:p>
             <w:pPr>
-              <w:spacing w:after="100" w:before="100"/>
+              <w:spacing w:after="60" w:before="60"/>
             </w:pPr>
             <w:r>
               <w:rPr>
@@ -957,7 +957,7 @@
           </w:tcPr>
           <w:p>
             <w:pPr>
-              <w:spacing w:after="100" w:before="100"/>
+              <w:spacing w:after="60" w:before="60"/>
             </w:pPr>
             <w:r>
               <w:rPr>
@@ -973,7 +973,7 @@
           </w:tcPr>
           <w:p>
             <w:pPr>
-              <w:spacing w:after="100" w:before="100"/>
+              <w:spacing w:after="60" w:before="60"/>
             </w:pPr>
             <w:r>
               <w:rPr>
@@ -989,7 +989,7 @@
           </w:tcPr>
           <w:p>
             <w:pPr>
-              <w:spacing w:after="100" w:before="100"/>
+              <w:spacing w:after="60" w:before="60"/>
             </w:pPr>
             <w:r>
               <w:rPr>
@@ -1007,7 +1007,7 @@
           </w:tcPr>
           <w:p>
             <w:pPr>
-              <w:spacing w:after="100" w:before="100"/>
+              <w:spacing w:after="60" w:before="60"/>
             </w:pPr>
             <w:r>
               <w:rPr>
@@ -1023,7 +1023,7 @@
           </w:tcPr>
           <w:p>
             <w:pPr>
-              <w:spacing w:after="100" w:before="100"/>
+              <w:spacing w:after="60" w:before="60"/>
             </w:pPr>
             <w:r>
               <w:rPr>
@@ -1039,7 +1039,7 @@
           </w:tcPr>
           <w:p>
             <w:pPr>
-              <w:spacing w:after="100" w:before="100"/>
+              <w:spacing w:after="60" w:before="60"/>
             </w:pPr>
             <w:r>
               <w:rPr>
@@ -1057,7 +1057,7 @@
           </w:tcPr>
           <w:p>
             <w:pPr>
-              <w:spacing w:after="100" w:before="100"/>
+              <w:spacing w:after="60" w:before="60"/>
             </w:pPr>
             <w:r>
               <w:rPr>
@@ -1073,7 +1073,7 @@
           </w:tcPr>
           <w:p>
             <w:pPr>
-              <w:spacing w:after="100" w:before="100"/>
+              <w:spacing w:after="60" w:before="60"/>
             </w:pPr>
             <w:r>
               <w:rPr>
@@ -1089,7 +1089,7 @@
           </w:tcPr>
           <w:p>
             <w:pPr>
-              <w:spacing w:after="100" w:before="100"/>
+              <w:spacing w:after="60" w:before="60"/>
             </w:pPr>
             <w:r>
               <w:rPr>
@@ -1126,7 +1126,7 @@
           </w:tcPr>
           <w:p>
             <w:pPr>
-              <w:spacing w:after="100" w:before="100"/>
+              <w:spacing w:after="60" w:before="60"/>
             </w:pPr>
             <w:r>
               <w:rPr>
@@ -1143,7 +1143,7 @@
           </w:tcPr>
           <w:p>
             <w:pPr>
-              <w:spacing w:after="100" w:before="100"/>
+              <w:spacing w:after="60" w:before="60"/>
             </w:pPr>
             <w:r>
               <w:rPr>
@@ -1162,7 +1162,7 @@
           </w:tcPr>
           <w:p>
             <w:pPr>
-              <w:spacing w:after="100" w:before="100"/>
+              <w:spacing w:after="60" w:before="60"/>
             </w:pPr>
             <w:r>
               <w:rPr>
@@ -1178,7 +1178,7 @@
           </w:tcPr>
           <w:p>
             <w:pPr>
-              <w:spacing w:after="100" w:before="100"/>
+              <w:spacing w:after="60" w:before="60"/>
             </w:pPr>
             <w:r>
               <w:rPr>
@@ -1196,7 +1196,7 @@
           </w:tcPr>
           <w:p>
             <w:pPr>
-              <w:spacing w:after="100" w:before="100"/>
+              <w:spacing w:after="60" w:before="60"/>
             </w:pPr>
             <w:r>
               <w:rPr>
@@ -1212,7 +1212,7 @@
           </w:tcPr>
           <w:p>
             <w:pPr>
-              <w:spacing w:after="100" w:before="100"/>
+              <w:spacing w:after="60" w:before="60"/>
             </w:pPr>
             <w:r>
               <w:rPr>
@@ -1230,7 +1230,7 @@
           </w:tcPr>
           <w:p>
             <w:pPr>
-              <w:spacing w:after="100" w:before="100"/>
+              <w:spacing w:after="60" w:before="60"/>
             </w:pPr>
             <w:r>
               <w:rPr>
@@ -1246,7 +1246,7 @@
           </w:tcPr>
           <w:p>
             <w:pPr>
-              <w:spacing w:after="100" w:before="100"/>
+              <w:spacing w:after="60" w:before="60"/>
             </w:pPr>
             <w:r>
               <w:rPr>
@@ -1264,7 +1264,7 @@
           </w:tcPr>
           <w:p>
             <w:pPr>
-              <w:spacing w:after="100" w:before="100"/>
+              <w:spacing w:after="60" w:before="60"/>
             </w:pPr>
             <w:r>
               <w:rPr>
@@ -1280,7 +1280,7 @@
           </w:tcPr>
           <w:p>
             <w:pPr>
-              <w:spacing w:after="100" w:before="100"/>
+              <w:spacing w:after="60" w:before="60"/>
             </w:pPr>
             <w:r>
               <w:rPr>
@@ -1309,11 +1309,6 @@
       </w:r>
     </w:p>
     <w:p>
-      <w:r>
-        <w:br w:type="page"/>
-      </w:r>
-    </w:p>
-    <w:p>
       <w:pPr>
         <w:pStyle w:val="Heading1"/>
       </w:pPr>
@@ -1326,15 +1321,7 @@
         <w:rPr>
           <w:b w:val="0"/>
         </w:rPr>
-        <w:t>В ходе работы изучены цветовые модели RGB, CMYK и HLS и способы перехода между ними. RGB описывает аддитивное смешение света и применяется для экранного представления цвета. CMYK описывает субтрактивное смешение красок и используется в печати. HLS позволяет отдельно задавать тон, светлоту и насыщенность, поэтому удобна для подбора цвета. Выбор модели зависит от задачи, хотя один цвет можно выразить координатами каждой из рассмотренных моделей.</w:t>
-      </w:r>
-    </w:p>
-    <w:p>
-      <w:pPr>
-        <w:pStyle w:val="Heading2"/>
-      </w:pPr>
-      <w:r>
-        <w:t>Обратимость преобразований</w:t>
+        <w:t>Изучены модели RGB, CMYK и HLS и преобразования между ними. RGB применяется для экранов, CMYK — для печати, HLS удобна для подбора тона, светлоты и насыщенности.</w:t>
       </w:r>
     </w:p>
     <w:p>
@@ -1342,7 +1329,7 @@
         <w:rPr>
           <w:b w:val="0"/>
         </w:rPr>
-        <w:t>Сохранение цвета при пересчёте не означает обязательного восстановления исходных координат. В учебных формулах CMYK разные сочетания четырёх компонент могут давать одинаковый RGB. Например, CMYK (100%, 100%, 100%, 0%) и (0%, 0%, 0%, 100%) преобразуются в чёрный RGB (0, 0, 0). Обратный алгоритм выбирает второй набор. Следовательно, цикл CMYK → RGB → CMYK может изменить доли красок, сохранив отображаемый цвет. При K = 100% результат не зависит от C, M и Y; для чёрного RGB в обратной формуле необходима отдельная ветвь, исключающая деление на ноль.</w:t>
+        <w:t>Пересчёт сохраняет цвет, но не всегда исходные координаты: разные наборы CMYK могут давать одинаковый RGB. В HLS при нулевой насыщенности тон не влияет на цвет и не восстанавливается из RGB. Поэтому изменение координат при обратном преобразовании не обязательно означает ошибку.</w:t>
       </w:r>
     </w:p>
     <w:p>
@@ -1350,47 +1337,7 @@
         <w:rPr>
           <w:b w:val="0"/>
         </w:rPr>
-        <w:t>В HLS неоднозначность возникает для ахроматических цветов. При S = 0% тон не влияет на результат: HLS (0°, 50%, 0%) и (120°, 50%, 0%) дают одинаковый серый цвет. Восстановить исходный тон из RGB невозможно, поэтому алгоритм условно принимает H = 0°. При L = 0% получается чёрный, а при L = 100% — белый независимо от тона и насыщенности. Такие изменения координат при обратном пересчёте связаны со свойствами модели, а не обязательно с ошибкой вычислений.</w:t>
-      </w:r>
-    </w:p>
-    <w:p>
-      <w:pPr>
-        <w:pStyle w:val="Heading2"/>
-      </w:pPr>
-      <w:r>
-        <w:t>Точность вычислений</w:t>
-      </w:r>
-    </w:p>
-    <w:p>
-      <w:r>
-        <w:rPr>
-          <w:b w:val="0"/>
-        </w:rPr>
-        <w:t>Округление RGB до целых значений приводит к потере части информации. Например, HLS (120°, 25%, 100%) даёт RGB (0, 127,5, 0), тогда как HEX #008000 соответствует RGB (0, 128, 0). После обратного пересчёта округлённого значения светлота составит примерно 25,098%, а не 25%. Поэтому в приложении промежуточные значения сохраняются с дробной точностью, а округление до 8 бит выполняется только для HEX и стандартной палитры. Поля показывают до трёх знаков после запятой, что также нужно учитывать при сравнении отображаемых чисел.</w:t>
-      </w:r>
-    </w:p>
-    <w:p>
-      <w:r>
-        <w:rPr>
-          <w:b w:val="0"/>
-        </w:rPr>
-        <w:t>Проверки циклов RGB → модель → RGB показали максимальную ошибку около 4,2633 × 10⁻¹³ при допуске 10⁻⁸. Это подтверждает численную согласованность реализованных формул на проверенном наборе цветов. Такой результат не означает обратимость любых исходных координат CMYK или HLS и не оценивает точность реальной цветопередачи устройств.</w:t>
-      </w:r>
-    </w:p>
-    <w:p>
-      <w:pPr>
-        <w:pStyle w:val="Heading2"/>
-      </w:pPr>
-      <w:r>
-        <w:t>Практическое применение</w:t>
-      </w:r>
-    </w:p>
-    <w:p>
-      <w:r>
-        <w:rPr>
-          <w:b w:val="0"/>
-        </w:rPr>
-        <w:t>Синхронное отображение трёх моделей позволяет наблюдать, как изменение одной компоненты отражается на остальных представлениях цвета. Для печати учебного пересчёта RGB ↔ CMYK недостаточно: результат зависит от цветового профиля, бумаги и красок. Таким образом, приложение подходит для изучения моделей и проверки формул, а точное согласование экранного и печатного цвета требует учёта характеристик устройств.</w:t>
+        <w:t>Для уменьшения погрешности промежуточные расчёты сохраняют дробную точность. Тесты подтвердили согласованность формул в пределах допуска. Учебный пересчёт CMYK не учитывает особенности принтера, бумаги и красок, поэтому не гарантирует точного совпадения экранного и печатного цвета.</w:t>
       </w:r>
     </w:p>
     <w:sectPr>

</xml_diff>